<commit_message>
adding Ken Lord's 4-22-2026 changes based on discussion
</commit_message>
<xml_diff>
--- a/docs/ucm/UCM_Design_Principles.docx
+++ b/docs/ucm/UCM_Design_Principles.docx
@@ -4,112 +4,20 @@
   <w:body>
     <w:p>
       <w:pPr>
-        <w:pStyle w:val="Title"/>
+        <w:pStyle w:val="Heading1"/>
       </w:pPr>
       <w:r>
         <w:t>Unified Care Model (UCM)</w:t>
       </w:r>
+    </w:p>
+    <w:p>
       <w:r>
-        <w:br/>
-      </w:r>
-      <w:r>
-        <w:rPr>
-          <w:sz w:val="34"/>
-        </w:rPr>
-        <w:t>Updated Design Principles</w:t>
+        <w:t>Design Principles</w:t>
       </w:r>
     </w:p>
     <w:p>
       <w:r>
-        <w:rPr>
-          <w:b/>
-        </w:rPr>
-        <w:t xml:space="preserve">Purpose. </w:t>
-      </w:r>
-      <w:r>
-        <w:t>This revision updates the design-principles document to reflect the current UCM, including its SULO/BFO grounding, role-based subject model, separation of domain terminology, and the new treatment of groups such as families and households as possible subjects of processes.</w:t>
-      </w:r>
-    </w:p>
-    <w:tbl>
-      <w:tblPr>
-        <w:tblW w:w="0" w:type="auto"/>
-        <w:tblLook w:val="04A0" w:firstRow="1" w:lastRow="0" w:firstColumn="1" w:lastColumn="0" w:noHBand="0" w:noVBand="1"/>
-      </w:tblPr>
-      <w:tblGrid>
-        <w:gridCol w:w="9792"/>
-      </w:tblGrid>
-      <w:tr>
-        <w:tc>
-          <w:tcPr>
-            <w:tcW w:w="9792" w:type="dxa"/>
-            <w:shd w:val="clear" w:color="auto" w:fill="EEF5FC"/>
-            <w:tcMar>
-              <w:top w:w="110" w:type="dxa"/>
-              <w:left w:w="130" w:type="dxa"/>
-              <w:bottom w:w="110" w:type="dxa"/>
-              <w:right w:w="130" w:type="dxa"/>
-            </w:tcMar>
-          </w:tcPr>
-          <w:p>
-            <w:pPr>
-              <w:spacing w:after="0"/>
-            </w:pPr>
-            <w:r>
-              <w:rPr>
-                <w:b/>
-              </w:rPr>
-              <w:t xml:space="preserve">Key modeling shift: </w:t>
-            </w:r>
-            <w:r>
-              <w:t xml:space="preserve">the UCM now distinguishes a neutral </w:t>
-            </w:r>
-            <w:r>
-              <w:rPr>
-                <w:i/>
-              </w:rPr>
-              <w:t>SubjectRole</w:t>
-            </w:r>
-            <w:r>
-              <w:t xml:space="preserve"> from domain-specific role labels such as </w:t>
-            </w:r>
-            <w:r>
-              <w:rPr>
-                <w:i/>
-              </w:rPr>
-              <w:t>PatientRole</w:t>
-            </w:r>
-            <w:r>
-              <w:t xml:space="preserve">, </w:t>
-            </w:r>
-            <w:r>
-              <w:rPr>
-                <w:i/>
-              </w:rPr>
-              <w:t>ClientRole</w:t>
-            </w:r>
-            <w:r>
-              <w:t xml:space="preserve">, </w:t>
-            </w:r>
-            <w:r>
-              <w:rPr>
-                <w:i/>
-              </w:rPr>
-              <w:t>MemberRole</w:t>
-            </w:r>
-            <w:r>
-              <w:t>, and allows both persons and groups to function as subjects in care and administrative contexts.</w:t>
-            </w:r>
-          </w:p>
-        </w:tc>
-      </w:tr>
-    </w:tbl>
-    <w:p/>
-    <w:p>
-      <w:pPr>
-        <w:pStyle w:val="Heading1"/>
-      </w:pPr>
-      <w:r>
-        <w:t>Design principles</w:t>
+        <w:t>Version aligned to ontology update dated 2026-04-22</w:t>
       </w:r>
     </w:p>
     <w:p>
@@ -117,12 +25,12 @@
         <w:pStyle w:val="Heading2"/>
       </w:pPr>
       <w:r>
-        <w:t>1. Foundational ontology alignment</w:t>
+        <w:t>Purpose</w:t>
       </w:r>
     </w:p>
     <w:p>
       <w:r>
-        <w:t>The UCM is grounded in SULO and aligned to BFO. Core distinctions such as physical entity, information entity, role, and process are inherited from this upper-level foundation so that the model remains logically coherent, reusable, and interoperable across clinical, social, and administrative domains.</w:t>
+        <w:t>This revision integrates prior design principles with explicit treatment of group modeling, role-mediated membership, and layered alignment to external models including FHIR, Common Core Ontologies (CCO), and schema.org. It preserves ontological grounding in BFO, semantic organization via SULO, and separation of inference from ontology.</w:t>
       </w:r>
     </w:p>
     <w:p>
@@ -130,12 +38,27 @@
         <w:pStyle w:val="Heading2"/>
       </w:pPr>
       <w:r>
-        <w:t>2. Role-based identity</w:t>
+        <w:t>Layered alignment clarification</w:t>
       </w:r>
     </w:p>
     <w:p>
       <w:r>
-        <w:t>Contextual identities are modeled as roles rather than as primitive human types. A person becomes a patient, client, member, provider, payer, or requester by bearing the corresponding role in an appropriate context.</w:t>
+        <w:t>The UCM uses layered alignment to distinguish ontological commitment, semantic organization, and interoperability mapping.</w:t>
+      </w:r>
+    </w:p>
+    <w:p>
+      <w:r>
+        <w:t>BFO: Ontological grounding for physical entities, roles, processes, and information entities.</w:t>
+      </w:r>
+    </w:p>
+    <w:p>
+      <w:r>
+        <w:t>SULO: Semantic organization supporting reusable classification without implying full equivalence.</w:t>
+      </w:r>
+    </w:p>
+    <w:p>
+      <w:r>
+        <w:t>External models (FHIR, HL7, schema.org, HUD): Interoperability mappings rather than ontological equivalence.</w:t>
       </w:r>
     </w:p>
     <w:p>
@@ -143,12 +66,93 @@
         <w:pStyle w:val="Heading2"/>
       </w:pPr>
       <w:r>
-        <w:t>3. Separation of semantic role from domain terminology</w:t>
+        <w:t>Design principles</w:t>
       </w:r>
     </w:p>
     <w:p>
       <w:r>
-        <w:t>The model uses a neutral abstraction, SubjectRole, for the general idea of being the focus or recipient of an activity, observation, or administrative process. Domain-specific terms such as patient, client, and member are retained as distinct subroles so the model can preserve source semantics rather than collapsing them into a single label.</w:t>
+        <w:t>Foundational ontology alignment. The UCM is grounded in BFO and organized through SULO.</w:t>
+      </w:r>
+    </w:p>
+    <w:p>
+      <w:r>
+        <w:t>Layered alignment semantics. Alignment strength varies by layer: BFO (strong), SULO (organizational), external models (mapping).</w:t>
+      </w:r>
+    </w:p>
+    <w:p>
+      <w:r>
+        <w:t>Role-based identity. Contextual identity is expressed through roles rather than intrinsic types.</w:t>
+      </w:r>
+    </w:p>
+    <w:p>
+      <w:r>
+        <w:t>Separation of semantic role from domain terminology. Neutral abstractions (SubjectRole, AgentRole) unify patterns while preserving domain-specific labels.</w:t>
+      </w:r>
+    </w:p>
+    <w:p>
+      <w:r>
+        <w:t>Support for individual and collective subjects. Both persons and groups (families, households) may serve as subjects.</w:t>
+      </w:r>
+    </w:p>
+    <w:p>
+      <w:r>
+        <w:t>Explicit group modeling. Groups such as families and households are first-class entities.</w:t>
+      </w:r>
+    </w:p>
+    <w:p>
+      <w:r>
+        <w:t>Distinction between participation and membership. Participation represents involvement in a process; membership represents structural belonging.</w:t>
+      </w:r>
+    </w:p>
+    <w:p>
+      <w:r>
+        <w:lastRenderedPageBreak/>
+        <w:t>Role-mediated membership. Membership is modeled as Person → playsRole → MembershipRole → memberOf → Group.</w:t>
+      </w:r>
+    </w:p>
+    <w:p>
+      <w:r>
+        <w:t>Contextual participation. Participation links actor, role, and process explicitly.</w:t>
+      </w:r>
+    </w:p>
+    <w:p>
+      <w:r>
+        <w:t>Temporal context. Roles and memberships may include temporal boundaries.</w:t>
+      </w:r>
+    </w:p>
+    <w:p>
+      <w:r>
+        <w:t>Domain decoupling with cross-domain reuse. Domains remain distinct while sharing core abstractions.</w:t>
+      </w:r>
+    </w:p>
+    <w:p>
+      <w:r>
+        <w:t>Policy and regulatory sensitivity. Role distinctions are preserved due to governance implications.</w:t>
+      </w:r>
+    </w:p>
+    <w:p>
+      <w:r>
+        <w:t>Descriptive text separated from logical commitment. Narrative definitions do not impose logic without axioms.</w:t>
+      </w:r>
+    </w:p>
+    <w:p>
+      <w:r>
+        <w:t>Non-destructive extension. The model evolves without breaking prior structures.</w:t>
+      </w:r>
+    </w:p>
+    <w:p>
+      <w:r>
+        <w:t>Interoperability abstraction. External models are mapped to UCM abstractions without semantic loss.</w:t>
+      </w:r>
+    </w:p>
+    <w:p>
+      <w:r>
+        <w:t>External ontology alignment. UCM aligns to CCO, schema.org, and FHIR using equivalence, subclassing, or mapping depending on strength.</w:t>
+      </w:r>
+    </w:p>
+    <w:p>
+      <w:r>
+        <w:t>Agentive accountability and provenance. Distinguishes enduring entities from roles they play in records and processes.</w:t>
       </w:r>
     </w:p>
     <w:p>
@@ -156,12 +160,37 @@
         <w:pStyle w:val="Heading2"/>
       </w:pPr>
       <w:r>
-        <w:t>4. Support for both individual and collective subjects</w:t>
+        <w:t>Implications for the current UCM</w:t>
       </w:r>
     </w:p>
     <w:p>
       <w:r>
-        <w:t>The UCM recognizes that the subject of a process may be an individual person or a group treated as a unit. Families, households, and other groups may therefore bear subject roles and be the focus of provisioning, assessment, eligibility, or authorization processes.</w:t>
+        <w:t>SubjectRole unifies PatientRole, ClientRole, and MemberRole.</w:t>
+      </w:r>
+    </w:p>
+    <w:p>
+      <w:r>
+        <w:t>Groups can act as subjects in processes such as eligibility, provisioning, and assessment.</w:t>
+      </w:r>
+    </w:p>
+    <w:p>
+      <w:r>
+        <w:t>Membership and participation remain distinct but interoperable constructs.</w:t>
+      </w:r>
+    </w:p>
+    <w:p>
+      <w:r>
+        <w:t>Roles provide context-specific meaning for entities.</w:t>
+      </w:r>
+    </w:p>
+    <w:p>
+      <w:r>
+        <w:t>Agent pattern supports provenance such as authorship, custody, and authentication.</w:t>
+      </w:r>
+    </w:p>
+    <w:p>
+      <w:r>
+        <w:t>External mappings preserve source semantics without collapsing models.</w:t>
       </w:r>
     </w:p>
     <w:p>
@@ -169,621 +198,32 @@
         <w:pStyle w:val="Heading2"/>
       </w:pPr>
       <w:r>
-        <w:t>5. Distinction between participation and membership</w:t>
+        <w:t>Recommended ontology updates reflected in the new version</w:t>
       </w:r>
     </w:p>
     <w:p>
       <w:r>
-        <w:t>The model distinguishes involvement in a process from structural belonging to a group. Participation captures who takes part in an occurrent and in what role; membership captures who belongs to a family, household, or other collective subject. These are related but not interchangeable patterns.</w:t>
-      </w:r>
-    </w:p>
-    <w:p>
-      <w:pPr>
-        <w:pStyle w:val="Heading2"/>
-      </w:pPr>
-      <w:r>
-        <w:t>6. Contextual participation</w:t>
+        <w:t>Explicit alignment annotations for BFO, SULO, and external ontologies.</w:t>
       </w:r>
     </w:p>
     <w:p>
       <w:r>
-        <w:t>Participation is modeled explicitly so that an actor, the role they bear in that context, and the process in which they are involved can all be represented together. This allows the same person or group to appear in different roles across different processes without changing their underlying identity.</w:t>
-      </w:r>
-    </w:p>
-    <w:p>
-      <w:pPr>
-        <w:pStyle w:val="Heading2"/>
-      </w:pPr>
-      <w:r>
-        <w:lastRenderedPageBreak/>
-        <w:t>7. Domain decoupling with cross-domain reuse</w:t>
+        <w:t>Consistent modeling of group membership through role-mediated patterns.</w:t>
       </w:r>
     </w:p>
     <w:p>
       <w:r>
-        <w:t>Clinical care, social care, public health, and administrative activities are represented as distinct domains, while still sharing common abstractions such as process, condition, subject, role, and participation. This supports interoperability without forcing all domains into a clinical vocabulary.</w:t>
-      </w:r>
-    </w:p>
-    <w:p>
-      <w:pPr>
-        <w:pStyle w:val="Heading2"/>
-      </w:pPr>
-      <w:r>
-        <w:t>8. Policy and regulatory sensitivity</w:t>
+        <w:t>Inclusion of temporal properties for roles and memberships.</w:t>
       </w:r>
     </w:p>
     <w:p>
       <w:r>
-        <w:t>Domain-specific role labels are preserved because they may trigger different privacy, consent, disclosure, and governance requirements. For example, patient, client, and member may refer to similar functional positions while carrying materially different regulatory implications.</w:t>
+        <w:t>Integration of external ontology mappings (FHIR, CCO, schema.org) using layered alignment strategy.</w:t>
       </w:r>
-    </w:p>
-    <w:p>
-      <w:pPr>
-        <w:pStyle w:val="Heading2"/>
-      </w:pPr>
-      <w:r>
-        <w:t>9. Descriptive text separated from logical commitment</w:t>
-      </w:r>
-    </w:p>
-    <w:p>
-      <w:r>
-        <w:t>Natural-language definitions may narrow or clarify intended use, but they do not change ontology behavior unless formal axioms are added. This lets the model document intended interpretation without over-constraining it prematurely.</w:t>
-      </w:r>
-    </w:p>
-    <w:p>
-      <w:pPr>
-        <w:pStyle w:val="Heading2"/>
-      </w:pPr>
-      <w:r>
-        <w:t>10. Non-destructive extension</w:t>
-      </w:r>
-    </w:p>
-    <w:p>
-      <w:r>
-        <w:t>New capabilities are added by extension and refactoring rather than by breaking existing core structures. This keeps the UCM stable over time while allowing new domains, roles, and subject patterns to be incorporated.</w:t>
-      </w:r>
-    </w:p>
-    <w:p>
-      <w:pPr>
-        <w:pStyle w:val="Heading2"/>
-      </w:pPr>
-      <w:r>
-        <w:t>11. Interoperability abstraction</w:t>
-      </w:r>
-    </w:p>
-    <w:p>
-      <w:r>
-        <w:t>External data models such as FHIR, HL7 v2, and HUD-aligned data structures are mapped to shared UCM abstractions without erasing their terminology. This supports crosswalks and semantic harmonization while preserving source-specific distinctions.</w:t>
-      </w:r>
-    </w:p>
-    <w:p>
-      <w:pPr>
-        <w:pStyle w:val="Heading2"/>
-      </w:pPr>
-      <w:r>
-        <w:t>12. Governance-ready semantics</w:t>
-      </w:r>
-    </w:p>
-    <w:p>
-      <w:r>
-        <w:t>The model is intended to support lifecycle management, mapping governance, search/discovery layers, and policy-aware reuse. Design choices are made not only for logical cleanliness but also for long-term maintainability and operational use.</w:t>
-      </w:r>
-    </w:p>
-    <w:p>
-      <w:pPr>
-        <w:pStyle w:val="Heading1"/>
-      </w:pPr>
-      <w:r>
-        <w:t>Implications for the current UCM</w:t>
-      </w:r>
-    </w:p>
-    <w:tbl>
-      <w:tblPr>
-        <w:tblStyle w:val="TableGrid"/>
-        <w:tblW w:w="0" w:type="auto"/>
-        <w:tblLayout w:type="fixed"/>
-        <w:tblLook w:val="04A0" w:firstRow="1" w:lastRow="0" w:firstColumn="1" w:lastColumn="0" w:noHBand="0" w:noVBand="1"/>
-      </w:tblPr>
-      <w:tblGrid>
-        <w:gridCol w:w="3264"/>
-        <w:gridCol w:w="3264"/>
-        <w:gridCol w:w="3672"/>
-      </w:tblGrid>
-      <w:tr>
-        <w:tc>
-          <w:tcPr>
-            <w:tcW w:w="3264" w:type="dxa"/>
-            <w:shd w:val="clear" w:color="auto" w:fill="D9EAF7"/>
-            <w:tcMar>
-              <w:top w:w="80" w:type="dxa"/>
-              <w:left w:w="100" w:type="dxa"/>
-              <w:bottom w:w="80" w:type="dxa"/>
-              <w:right w:w="100" w:type="dxa"/>
-            </w:tcMar>
-          </w:tcPr>
-          <w:p>
-            <w:pPr>
-              <w:spacing w:after="40"/>
-            </w:pPr>
-            <w:r>
-              <w:rPr>
-                <w:b/>
-                <w:color w:val="1F4E79"/>
-                <w:sz w:val="19"/>
-              </w:rPr>
-              <w:t>Model area</w:t>
-            </w:r>
-          </w:p>
-        </w:tc>
-        <w:tc>
-          <w:tcPr>
-            <w:tcW w:w="3264" w:type="dxa"/>
-            <w:shd w:val="clear" w:color="auto" w:fill="D9EAF7"/>
-            <w:tcMar>
-              <w:top w:w="80" w:type="dxa"/>
-              <w:left w:w="100" w:type="dxa"/>
-              <w:bottom w:w="80" w:type="dxa"/>
-              <w:right w:w="100" w:type="dxa"/>
-            </w:tcMar>
-          </w:tcPr>
-          <w:p>
-            <w:pPr>
-              <w:spacing w:after="40"/>
-            </w:pPr>
-            <w:r>
-              <w:rPr>
-                <w:b/>
-                <w:color w:val="1F4E79"/>
-                <w:sz w:val="19"/>
-              </w:rPr>
-              <w:t>Current treatment</w:t>
-            </w:r>
-          </w:p>
-        </w:tc>
-        <w:tc>
-          <w:tcPr>
-            <w:tcW w:w="3264" w:type="dxa"/>
-            <w:shd w:val="clear" w:color="auto" w:fill="D9EAF7"/>
-            <w:tcMar>
-              <w:top w:w="80" w:type="dxa"/>
-              <w:left w:w="100" w:type="dxa"/>
-              <w:bottom w:w="80" w:type="dxa"/>
-              <w:right w:w="100" w:type="dxa"/>
-            </w:tcMar>
-          </w:tcPr>
-          <w:p>
-            <w:pPr>
-              <w:spacing w:after="40"/>
-            </w:pPr>
-            <w:r>
-              <w:rPr>
-                <w:b/>
-                <w:color w:val="1F4E79"/>
-                <w:sz w:val="19"/>
-              </w:rPr>
-              <w:t>Design implication</w:t>
-            </w:r>
-          </w:p>
-        </w:tc>
-      </w:tr>
-      <w:tr>
-        <w:tc>
-          <w:tcPr>
-            <w:tcW w:w="3024" w:type="dxa"/>
-            <w:tcMar>
-              <w:top w:w="80" w:type="dxa"/>
-              <w:left w:w="100" w:type="dxa"/>
-              <w:bottom w:w="80" w:type="dxa"/>
-              <w:right w:w="100" w:type="dxa"/>
-            </w:tcMar>
-          </w:tcPr>
-          <w:p>
-            <w:pPr>
-              <w:spacing w:after="40"/>
-            </w:pPr>
-            <w:r>
-              <w:rPr>
-                <w:sz w:val="19"/>
-              </w:rPr>
-              <w:t>Foundational classes</w:t>
-            </w:r>
-          </w:p>
-        </w:tc>
-        <w:tc>
-          <w:tcPr>
-            <w:tcW w:w="3240" w:type="dxa"/>
-            <w:tcMar>
-              <w:top w:w="80" w:type="dxa"/>
-              <w:left w:w="100" w:type="dxa"/>
-              <w:bottom w:w="80" w:type="dxa"/>
-              <w:right w:w="100" w:type="dxa"/>
-            </w:tcMar>
-          </w:tcPr>
-          <w:p>
-            <w:pPr>
-              <w:spacing w:after="40"/>
-            </w:pPr>
-            <w:r>
-              <w:rPr>
-                <w:sz w:val="19"/>
-              </w:rPr>
-              <w:t>PhysicalEntity, InformationalEntity, ActorRole, and Process remain aligned to SULO/BFO.</w:t>
-            </w:r>
-          </w:p>
-        </w:tc>
-        <w:tc>
-          <w:tcPr>
-            <w:tcW w:w="3672" w:type="dxa"/>
-            <w:tcMar>
-              <w:top w:w="80" w:type="dxa"/>
-              <w:left w:w="100" w:type="dxa"/>
-              <w:bottom w:w="80" w:type="dxa"/>
-              <w:right w:w="100" w:type="dxa"/>
-            </w:tcMar>
-          </w:tcPr>
-          <w:p>
-            <w:pPr>
-              <w:spacing w:after="40"/>
-            </w:pPr>
-            <w:r>
-              <w:rPr>
-                <w:sz w:val="19"/>
-              </w:rPr>
-              <w:t>The UCM should continue to express new classes by subclassing these foundations rather than inventing disconnected local primitives.</w:t>
-            </w:r>
-          </w:p>
-        </w:tc>
-      </w:tr>
-      <w:tr>
-        <w:tc>
-          <w:tcPr>
-            <w:tcW w:w="3024" w:type="dxa"/>
-            <w:tcMar>
-              <w:top w:w="80" w:type="dxa"/>
-              <w:left w:w="100" w:type="dxa"/>
-              <w:bottom w:w="80" w:type="dxa"/>
-              <w:right w:w="100" w:type="dxa"/>
-            </w:tcMar>
-          </w:tcPr>
-          <w:p>
-            <w:pPr>
-              <w:spacing w:after="40"/>
-            </w:pPr>
-            <w:r>
-              <w:rPr>
-                <w:sz w:val="19"/>
-              </w:rPr>
-              <w:t>Subject hierarchy</w:t>
-            </w:r>
-          </w:p>
-        </w:tc>
-        <w:tc>
-          <w:tcPr>
-            <w:tcW w:w="3240" w:type="dxa"/>
-            <w:tcMar>
-              <w:top w:w="80" w:type="dxa"/>
-              <w:left w:w="100" w:type="dxa"/>
-              <w:bottom w:w="80" w:type="dxa"/>
-              <w:right w:w="100" w:type="dxa"/>
-            </w:tcMar>
-          </w:tcPr>
-          <w:p>
-            <w:pPr>
-              <w:spacing w:after="40"/>
-            </w:pPr>
-            <w:r>
-              <w:rPr>
-                <w:sz w:val="19"/>
-              </w:rPr>
-              <w:t>SubjectRole now serves as the neutral superclass of PatientRole, ClientRole, and MemberRole.</w:t>
-            </w:r>
-          </w:p>
-        </w:tc>
-        <w:tc>
-          <w:tcPr>
-            <w:tcW w:w="3672" w:type="dxa"/>
-            <w:tcMar>
-              <w:top w:w="80" w:type="dxa"/>
-              <w:left w:w="100" w:type="dxa"/>
-              <w:bottom w:w="80" w:type="dxa"/>
-              <w:right w:w="100" w:type="dxa"/>
-            </w:tcMar>
-          </w:tcPr>
-          <w:p>
-            <w:pPr>
-              <w:spacing w:after="40"/>
-            </w:pPr>
-            <w:r>
-              <w:rPr>
-                <w:sz w:val="19"/>
-              </w:rPr>
-              <w:t>Mappings from source systems should choose the specific domain role where known, while still allowing cross-domain reasoning through SubjectRole.</w:t>
-            </w:r>
-          </w:p>
-        </w:tc>
-      </w:tr>
-      <w:tr>
-        <w:tc>
-          <w:tcPr>
-            <w:tcW w:w="3024" w:type="dxa"/>
-            <w:tcMar>
-              <w:top w:w="80" w:type="dxa"/>
-              <w:left w:w="100" w:type="dxa"/>
-              <w:bottom w:w="80" w:type="dxa"/>
-              <w:right w:w="100" w:type="dxa"/>
-            </w:tcMar>
-          </w:tcPr>
-          <w:p>
-            <w:pPr>
-              <w:spacing w:after="40"/>
-            </w:pPr>
-            <w:r>
-              <w:rPr>
-                <w:sz w:val="19"/>
-              </w:rPr>
-              <w:t>Patient</w:t>
-            </w:r>
-          </w:p>
-        </w:tc>
-        <w:tc>
-          <w:tcPr>
-            <w:tcW w:w="3240" w:type="dxa"/>
-            <w:tcMar>
-              <w:top w:w="80" w:type="dxa"/>
-              <w:left w:w="100" w:type="dxa"/>
-              <w:bottom w:w="80" w:type="dxa"/>
-              <w:right w:w="100" w:type="dxa"/>
-            </w:tcMar>
-          </w:tcPr>
-          <w:p>
-            <w:pPr>
-              <w:spacing w:after="40"/>
-            </w:pPr>
-            <w:r>
-              <w:rPr>
-                <w:sz w:val="19"/>
-              </w:rPr>
-              <w:t>Patient is modeled as a role-based classification of Person.</w:t>
-            </w:r>
-          </w:p>
-        </w:tc>
-        <w:tc>
-          <w:tcPr>
-            <w:tcW w:w="3672" w:type="dxa"/>
-            <w:tcMar>
-              <w:top w:w="80" w:type="dxa"/>
-              <w:left w:w="100" w:type="dxa"/>
-              <w:bottom w:w="80" w:type="dxa"/>
-              <w:right w:w="100" w:type="dxa"/>
-            </w:tcMar>
-          </w:tcPr>
-          <w:p>
-            <w:pPr>
-              <w:spacing w:after="40"/>
-            </w:pPr>
-            <w:r>
-              <w:rPr>
-                <w:sz w:val="19"/>
-              </w:rPr>
-              <w:t>The term patient stays available for clinical contexts without becoming the universal label for all care subjects.</w:t>
-            </w:r>
-          </w:p>
-        </w:tc>
-      </w:tr>
-      <w:tr>
-        <w:tc>
-          <w:tcPr>
-            <w:tcW w:w="3024" w:type="dxa"/>
-            <w:tcMar>
-              <w:top w:w="80" w:type="dxa"/>
-              <w:left w:w="100" w:type="dxa"/>
-              <w:bottom w:w="80" w:type="dxa"/>
-              <w:right w:w="100" w:type="dxa"/>
-            </w:tcMar>
-          </w:tcPr>
-          <w:p>
-            <w:pPr>
-              <w:spacing w:after="40"/>
-            </w:pPr>
-            <w:r>
-              <w:rPr>
-                <w:sz w:val="19"/>
-              </w:rPr>
-              <w:t>Groups</w:t>
-            </w:r>
-          </w:p>
-        </w:tc>
-        <w:tc>
-          <w:tcPr>
-            <w:tcW w:w="3240" w:type="dxa"/>
-            <w:tcMar>
-              <w:top w:w="80" w:type="dxa"/>
-              <w:left w:w="100" w:type="dxa"/>
-              <w:bottom w:w="80" w:type="dxa"/>
-              <w:right w:w="100" w:type="dxa"/>
-            </w:tcMar>
-          </w:tcPr>
-          <w:p>
-            <w:pPr>
-              <w:spacing w:after="40"/>
-            </w:pPr>
-            <w:r>
-              <w:rPr>
-                <w:sz w:val="19"/>
-              </w:rPr>
-              <w:t>Group, Family, and Household may act as collective subjects.</w:t>
-            </w:r>
-          </w:p>
-        </w:tc>
-        <w:tc>
-          <w:tcPr>
-            <w:tcW w:w="3672" w:type="dxa"/>
-            <w:tcMar>
-              <w:top w:w="80" w:type="dxa"/>
-              <w:left w:w="100" w:type="dxa"/>
-              <w:bottom w:w="80" w:type="dxa"/>
-              <w:right w:w="100" w:type="dxa"/>
-            </w:tcMar>
-          </w:tcPr>
-          <w:p>
-            <w:pPr>
-              <w:spacing w:after="40"/>
-            </w:pPr>
-            <w:r>
-              <w:rPr>
-                <w:sz w:val="19"/>
-              </w:rPr>
-              <w:t>Provisioning, eligibility, authorization, and similar processes can target a collective unit directly rather than only its individual members.</w:t>
-            </w:r>
-          </w:p>
-        </w:tc>
-      </w:tr>
-      <w:tr>
-        <w:tc>
-          <w:tcPr>
-            <w:tcW w:w="3024" w:type="dxa"/>
-            <w:tcMar>
-              <w:top w:w="80" w:type="dxa"/>
-              <w:left w:w="100" w:type="dxa"/>
-              <w:bottom w:w="80" w:type="dxa"/>
-              <w:right w:w="100" w:type="dxa"/>
-            </w:tcMar>
-          </w:tcPr>
-          <w:p>
-            <w:pPr>
-              <w:spacing w:after="40"/>
-            </w:pPr>
-            <w:r>
-              <w:rPr>
-                <w:sz w:val="19"/>
-              </w:rPr>
-              <w:lastRenderedPageBreak/>
-              <w:t>Membership</w:t>
-            </w:r>
-          </w:p>
-        </w:tc>
-        <w:tc>
-          <w:tcPr>
-            <w:tcW w:w="3240" w:type="dxa"/>
-            <w:tcMar>
-              <w:top w:w="80" w:type="dxa"/>
-              <w:left w:w="100" w:type="dxa"/>
-              <w:bottom w:w="80" w:type="dxa"/>
-              <w:right w:w="100" w:type="dxa"/>
-            </w:tcMar>
-          </w:tcPr>
-          <w:p>
-            <w:pPr>
-              <w:spacing w:after="40"/>
-            </w:pPr>
-            <w:r>
-              <w:rPr>
-                <w:sz w:val="19"/>
-              </w:rPr>
-              <w:t>Group membership is modeled separately from process participation.</w:t>
-            </w:r>
-          </w:p>
-        </w:tc>
-        <w:tc>
-          <w:tcPr>
-            <w:tcW w:w="3672" w:type="dxa"/>
-            <w:tcMar>
-              <w:top w:w="80" w:type="dxa"/>
-              <w:left w:w="100" w:type="dxa"/>
-              <w:bottom w:w="80" w:type="dxa"/>
-              <w:right w:w="100" w:type="dxa"/>
-            </w:tcMar>
-          </w:tcPr>
-          <w:p>
-            <w:pPr>
-              <w:spacing w:after="40"/>
-            </w:pPr>
-            <w:r>
-              <w:rPr>
-                <w:sz w:val="19"/>
-              </w:rPr>
-              <w:t>A household member is not automatically a participant in every process involving the household; explicit participation is still required.</w:t>
-            </w:r>
-          </w:p>
-        </w:tc>
-      </w:tr>
-      <w:tr>
-        <w:tc>
-          <w:tcPr>
-            <w:tcW w:w="3024" w:type="dxa"/>
-            <w:tcMar>
-              <w:top w:w="80" w:type="dxa"/>
-              <w:left w:w="100" w:type="dxa"/>
-              <w:bottom w:w="80" w:type="dxa"/>
-              <w:right w:w="100" w:type="dxa"/>
-            </w:tcMar>
-          </w:tcPr>
-          <w:p>
-            <w:pPr>
-              <w:spacing w:after="40"/>
-            </w:pPr>
-            <w:r>
-              <w:rPr>
-                <w:sz w:val="19"/>
-              </w:rPr>
-              <w:t>Privacy and policy</w:t>
-            </w:r>
-          </w:p>
-        </w:tc>
-        <w:tc>
-          <w:tcPr>
-            <w:tcW w:w="3240" w:type="dxa"/>
-            <w:tcMar>
-              <w:top w:w="80" w:type="dxa"/>
-              <w:left w:w="100" w:type="dxa"/>
-              <w:bottom w:w="80" w:type="dxa"/>
-              <w:right w:w="100" w:type="dxa"/>
-            </w:tcMar>
-          </w:tcPr>
-          <w:p>
-            <w:pPr>
-              <w:spacing w:after="40"/>
-            </w:pPr>
-            <w:r>
-              <w:rPr>
-                <w:sz w:val="19"/>
-              </w:rPr>
-              <w:t>Role labels remain semantically distinct.</w:t>
-            </w:r>
-          </w:p>
-        </w:tc>
-        <w:tc>
-          <w:tcPr>
-            <w:tcW w:w="3672" w:type="dxa"/>
-            <w:tcMar>
-              <w:top w:w="80" w:type="dxa"/>
-              <w:left w:w="100" w:type="dxa"/>
-              <w:bottom w:w="80" w:type="dxa"/>
-              <w:right w:w="100" w:type="dxa"/>
-            </w:tcMar>
-          </w:tcPr>
-          <w:p>
-            <w:pPr>
-              <w:spacing w:after="40"/>
-            </w:pPr>
-            <w:r>
-              <w:rPr>
-                <w:sz w:val="19"/>
-              </w:rPr>
-              <w:t>Policy overlays can later differentiate access or disclosure rules by role type and by domain.</w:t>
-            </w:r>
-          </w:p>
-        </w:tc>
-      </w:tr>
-    </w:tbl>
-    <w:p>
-      <w:pPr>
-        <w:pStyle w:val="Heading1"/>
-      </w:pPr>
     </w:p>
     <w:sectPr>
       <w:pgSz w:w="12240" w:h="15840"/>
-      <w:pgMar w:top="1080" w:right="1224" w:bottom="1080" w:left="1224" w:header="720" w:footer="720" w:gutter="0"/>
+      <w:pgMar w:top="1440" w:right="1800" w:bottom="1440" w:left="1800" w:header="720" w:footer="720" w:gutter="0"/>
       <w:cols w:space="720"/>
       <w:docGrid w:linePitch="360"/>
     </w:sectPr>
@@ -964,31 +404,31 @@
       </w:rPr>
     </w:lvl>
   </w:abstractNum>
-  <w:num w:numId="1" w16cid:durableId="440417440">
+  <w:num w:numId="1" w16cid:durableId="1845894673">
     <w:abstractNumId w:val="8"/>
   </w:num>
-  <w:num w:numId="2" w16cid:durableId="1583443067">
+  <w:num w:numId="2" w16cid:durableId="1062752316">
     <w:abstractNumId w:val="6"/>
   </w:num>
-  <w:num w:numId="3" w16cid:durableId="401490975">
+  <w:num w:numId="3" w16cid:durableId="1289898100">
     <w:abstractNumId w:val="5"/>
   </w:num>
-  <w:num w:numId="4" w16cid:durableId="1062481447">
+  <w:num w:numId="4" w16cid:durableId="547180727">
     <w:abstractNumId w:val="4"/>
   </w:num>
-  <w:num w:numId="5" w16cid:durableId="2006009541">
+  <w:num w:numId="5" w16cid:durableId="1139765675">
     <w:abstractNumId w:val="7"/>
   </w:num>
-  <w:num w:numId="6" w16cid:durableId="764419467">
+  <w:num w:numId="6" w16cid:durableId="952251515">
     <w:abstractNumId w:val="3"/>
   </w:num>
-  <w:num w:numId="7" w16cid:durableId="2018540141">
+  <w:num w:numId="7" w16cid:durableId="898789756">
     <w:abstractNumId w:val="2"/>
   </w:num>
-  <w:num w:numId="8" w16cid:durableId="636910843">
+  <w:num w:numId="8" w16cid:durableId="293096895">
     <w:abstractNumId w:val="1"/>
   </w:num>
-  <w:num w:numId="9" w16cid:durableId="1428113596">
+  <w:num w:numId="9" w16cid:durableId="2123186586">
     <w:abstractNumId w:val="0"/>
   </w:num>
 </w:numbering>
@@ -1384,13 +824,6 @@
     <w:name w:val="Normal"/>
     <w:qFormat/>
     <w:rsid w:val="00FC693F"/>
-    <w:pPr>
-      <w:spacing w:after="120" w:line="259" w:lineRule="auto"/>
-    </w:pPr>
-    <w:rPr>
-      <w:rFonts w:ascii="Aptos" w:hAnsi="Aptos"/>
-      <w:sz w:val="21"/>
-    </w:rPr>
   </w:style>
   <w:style w:type="paragraph" w:styleId="Heading1">
     <w:name w:val="heading 1"/>
@@ -1403,14 +836,14 @@
     <w:pPr>
       <w:keepNext/>
       <w:keepLines/>
-      <w:spacing w:before="200" w:after="80"/>
+      <w:spacing w:before="480" w:after="0"/>
       <w:outlineLvl w:val="0"/>
     </w:pPr>
     <w:rPr>
       <w:rFonts w:asciiTheme="majorHAnsi" w:eastAsiaTheme="majorEastAsia" w:hAnsiTheme="majorHAnsi" w:cstheme="majorBidi"/>
       <w:b/>
       <w:bCs/>
-      <w:color w:val="1F4E79"/>
+      <w:color w:val="365F91" w:themeColor="accent1" w:themeShade="BF"/>
       <w:sz w:val="28"/>
       <w:szCs w:val="28"/>
     </w:rPr>
@@ -1427,15 +860,15 @@
     <w:pPr>
       <w:keepNext/>
       <w:keepLines/>
-      <w:spacing w:before="160" w:after="40"/>
+      <w:spacing w:before="200" w:after="0"/>
       <w:outlineLvl w:val="1"/>
     </w:pPr>
     <w:rPr>
       <w:rFonts w:asciiTheme="majorHAnsi" w:eastAsiaTheme="majorEastAsia" w:hAnsiTheme="majorHAnsi" w:cstheme="majorBidi"/>
       <w:b/>
       <w:bCs/>
-      <w:color w:val="373737"/>
-      <w:sz w:val="23"/>
+      <w:color w:val="4F81BD" w:themeColor="accent1"/>
+      <w:sz w:val="26"/>
       <w:szCs w:val="26"/>
     </w:rPr>
   </w:style>
@@ -1741,11 +1174,10 @@
     </w:pPr>
     <w:rPr>
       <w:rFonts w:asciiTheme="majorHAnsi" w:eastAsiaTheme="majorEastAsia" w:hAnsiTheme="majorHAnsi" w:cstheme="majorBidi"/>
-      <w:b/>
-      <w:color w:val="1F4E79"/>
+      <w:color w:val="17365D" w:themeColor="text2" w:themeShade="BF"/>
       <w:spacing w:val="5"/>
       <w:kern w:val="28"/>
-      <w:sz w:val="44"/>
+      <w:sz w:val="52"/>
       <w:szCs w:val="52"/>
     </w:rPr>
   </w:style>
@@ -1821,6 +1253,9 @@
     <w:uiPriority w:val="99"/>
     <w:unhideWhenUsed/>
     <w:rsid w:val="00AA1D8D"/>
+    <w:pPr>
+      <w:spacing w:after="120"/>
+    </w:pPr>
   </w:style>
   <w:style w:type="character" w:customStyle="1" w:styleId="BodyTextChar">
     <w:name w:val="Body Text Char"/>
@@ -1837,7 +1272,7 @@
     <w:unhideWhenUsed/>
     <w:rsid w:val="00AA1D8D"/>
     <w:pPr>
-      <w:spacing w:line="480" w:lineRule="auto"/>
+      <w:spacing w:after="120" w:line="480" w:lineRule="auto"/>
     </w:pPr>
   </w:style>
   <w:style w:type="character" w:customStyle="1" w:styleId="BodyText2Char">
@@ -1854,6 +1289,9 @@
     <w:uiPriority w:val="99"/>
     <w:unhideWhenUsed/>
     <w:rsid w:val="00AA1D8D"/>
+    <w:pPr>
+      <w:spacing w:after="120"/>
+    </w:pPr>
     <w:rPr>
       <w:sz w:val="16"/>
       <w:szCs w:val="16"/>
@@ -1988,6 +1426,7 @@
     <w:unhideWhenUsed/>
     <w:rsid w:val="0029639D"/>
     <w:pPr>
+      <w:spacing w:after="120"/>
       <w:ind w:left="360"/>
       <w:contextualSpacing/>
     </w:pPr>
@@ -1999,6 +1438,7 @@
     <w:unhideWhenUsed/>
     <w:rsid w:val="0029639D"/>
     <w:pPr>
+      <w:spacing w:after="120"/>
       <w:ind w:left="720"/>
       <w:contextualSpacing/>
     </w:pPr>
@@ -2010,6 +1450,7 @@
     <w:unhideWhenUsed/>
     <w:rsid w:val="0029639D"/>
     <w:pPr>
+      <w:spacing w:after="120"/>
       <w:ind w:left="1080"/>
       <w:contextualSpacing/>
     </w:pPr>

</xml_diff>

<commit_message>
latest version of artifacts
</commit_message>
<xml_diff>
--- a/docs/ucm/UCM_Design_Principles.docx
+++ b/docs/ucm/UCM_Design_Principles.docx
@@ -4,20 +4,23 @@
   <w:body>
     <w:p>
       <w:pPr>
-        <w:pStyle w:val="Heading1"/>
+        <w:pStyle w:val="Title"/>
       </w:pPr>
       <w:r>
         <w:t>Unified Care Model (UCM)</w:t>
       </w:r>
     </w:p>
     <w:p>
+      <w:pPr>
+        <w:pStyle w:val="Heading1"/>
+      </w:pPr>
       <w:r>
         <w:t>Design Principles</w:t>
       </w:r>
     </w:p>
     <w:p>
       <w:r>
-        <w:t>Version aligned to ontology update dated 2026-04-22</w:t>
+        <w:t>Version aligned to ontology update dated 2026-04-28</w:t>
       </w:r>
     </w:p>
     <w:p>
@@ -30,7 +33,7 @@
     </w:p>
     <w:p>
       <w:r>
-        <w:t>This revision integrates prior design principles with explicit treatment of group modeling, role-mediated membership, and layered alignment to external models including FHIR, Common Core Ontologies (CCO), and schema.org. It preserves ontological grounding in BFO, semantic organization via SULO, and separation of inference from ontology.</w:t>
+        <w:t>This revision integrates prior design principles with explicit treatment of group modeling, role-mediated membership, definition-driven group semantics, and layered alignment to external models including FHIR, Common Core Ontologies (CCO), and schema.org. It preserves ontological grounding in BFO, semantic organization via SULO, and separation of inference from ontology.</w:t>
       </w:r>
     </w:p>
     <w:p>
@@ -86,28 +89,33 @@
     </w:p>
     <w:p>
       <w:r>
-        <w:t>Separation of semantic role from domain terminology. Neutral abstractions (SubjectRole, AgentRole) unify patterns while preserving domain-specific labels.</w:t>
+        <w:t>Separation of semantic role from domain terminology. Neutral abstractions unify patterns while preserving domain-specific labels.</w:t>
       </w:r>
     </w:p>
     <w:p>
       <w:r>
-        <w:t>Support for individual and collective subjects. Both persons and groups (families, households) may serve as subjects.</w:t>
+        <w:t>Support for individual and collective subjects. Both persons and groups may serve as subjects.</w:t>
       </w:r>
     </w:p>
     <w:p>
       <w:r>
-        <w:t>Explicit group modeling. Groups such as families and households are first-class entities.</w:t>
-      </w:r>
-    </w:p>
-    <w:p>
-      <w:r>
-        <w:t>Distinction between participation and membership. Participation represents involvement in a process; membership represents structural belonging.</w:t>
+        <w:t>Explicit group modeling. Groups are first-class entities whose identity is determined by definitional criteria, not just members.</w:t>
       </w:r>
     </w:p>
     <w:p>
       <w:r>
         <w:lastRenderedPageBreak/>
-        <w:t>Role-mediated membership. Membership is modeled as Person → playsRole → MembershipRole → memberOf → Group.</w:t>
+        <w:t>Definition-driven group semantics. Groups are defined via explicit definedBy relationships linking to DefinitionArtifact.</w:t>
+      </w:r>
+    </w:p>
+    <w:p>
+      <w:r>
+        <w:t>Distinction between participation and membership. Participation is process-based; membership is structural.</w:t>
+      </w:r>
+    </w:p>
+    <w:p>
+      <w:r>
+        <w:t>Role-mediated membership. Membership reflects application of definitional criteria via roles.</w:t>
       </w:r>
     </w:p>
     <w:p>
@@ -122,37 +130,42 @@
     </w:p>
     <w:p>
       <w:r>
-        <w:t>Domain decoupling with cross-domain reuse. Domains remain distinct while sharing core abstractions.</w:t>
+        <w:t>Domain decoupling with cross-domain reuse.</w:t>
       </w:r>
     </w:p>
     <w:p>
       <w:r>
-        <w:t>Policy and regulatory sensitivity. Role distinctions are preserved due to governance implications.</w:t>
+        <w:t>Policy and regulatory sensitivity.</w:t>
       </w:r>
     </w:p>
     <w:p>
       <w:r>
-        <w:t>Descriptive text separated from logical commitment. Narrative definitions do not impose logic without axioms.</w:t>
+        <w:t>Externalized semantic definition principle.</w:t>
       </w:r>
     </w:p>
     <w:p>
       <w:r>
-        <w:t>Non-destructive extension. The model evolves without breaking prior structures.</w:t>
+        <w:t>Descriptive text separated from logical commitment.</w:t>
       </w:r>
     </w:p>
     <w:p>
       <w:r>
-        <w:t>Interoperability abstraction. External models are mapped to UCM abstractions without semantic loss.</w:t>
+        <w:t>Non-destructive extension.</w:t>
       </w:r>
     </w:p>
     <w:p>
       <w:r>
-        <w:t>External ontology alignment. UCM aligns to CCO, schema.org, and FHIR using equivalence, subclassing, or mapping depending on strength.</w:t>
+        <w:t>Interoperability abstraction.</w:t>
       </w:r>
     </w:p>
     <w:p>
       <w:r>
-        <w:t>Agentive accountability and provenance. Distinguishes enduring entities from roles they play in records and processes.</w:t>
+        <w:t>External ontology alignment.</w:t>
+      </w:r>
+    </w:p>
+    <w:p>
+      <w:r>
+        <w:t>Agentive accountability and provenance.</w:t>
       </w:r>
     </w:p>
     <w:p>
@@ -165,32 +178,27 @@
     </w:p>
     <w:p>
       <w:r>
-        <w:t>SubjectRole unifies PatientRole, ClientRole, and MemberRole.</w:t>
+        <w:t>Groups can act as subjects in processes.</w:t>
       </w:r>
     </w:p>
     <w:p>
       <w:r>
-        <w:t>Groups can act as subjects in processes such as eligibility, provisioning, and assessment.</w:t>
+        <w:t>Membership and participation remain distinct.</w:t>
       </w:r>
     </w:p>
     <w:p>
       <w:r>
-        <w:t>Membership and participation remain distinct but interoperable constructs.</w:t>
+        <w:t>Group identity is determined by definedBy.</w:t>
       </w:r>
     </w:p>
     <w:p>
       <w:r>
-        <w:t>Roles provide context-specific meaning for entities.</w:t>
+        <w:t>Multiple groups with same membership may exist.</w:t>
       </w:r>
     </w:p>
     <w:p>
       <w:r>
-        <w:t>Agent pattern supports provenance such as authorship, custody, and authentication.</w:t>
-      </w:r>
-    </w:p>
-    <w:p>
-      <w:r>
-        <w:t>External mappings preserve source semantics without collapsing models.</w:t>
+        <w:t>No ontology-level equivalence based on membership.</w:t>
       </w:r>
     </w:p>
     <w:p>
@@ -198,27 +206,27 @@
         <w:pStyle w:val="Heading2"/>
       </w:pPr>
       <w:r>
-        <w:t>Recommended ontology updates reflected in the new version</w:t>
+        <w:t>Recommended ontology updates</w:t>
       </w:r>
     </w:p>
     <w:p>
       <w:r>
-        <w:t>Explicit alignment annotations for BFO, SULO, and external ontologies.</w:t>
+        <w:t>Introduction of definedBy on Group.</w:t>
       </w:r>
     </w:p>
     <w:p>
       <w:r>
-        <w:t>Consistent modeling of group membership through role-mediated patterns.</w:t>
+        <w:t>DefinitionArtifact concept.</w:t>
       </w:r>
     </w:p>
     <w:p>
       <w:r>
-        <w:t>Inclusion of temporal properties for roles and memberships.</w:t>
+        <w:t>Policy-driven group construction.</w:t>
       </w:r>
     </w:p>
     <w:p>
       <w:r>
-        <w:t>Integration of external ontology mappings (FHIR, CCO, schema.org) using layered alignment strategy.</w:t>
+        <w:t>Alignment enhancements.</w:t>
       </w:r>
     </w:p>
     <w:sectPr>
@@ -404,31 +412,31 @@
       </w:rPr>
     </w:lvl>
   </w:abstractNum>
-  <w:num w:numId="1" w16cid:durableId="1845894673">
+  <w:num w:numId="1" w16cid:durableId="1693916719">
     <w:abstractNumId w:val="8"/>
   </w:num>
-  <w:num w:numId="2" w16cid:durableId="1062752316">
+  <w:num w:numId="2" w16cid:durableId="1971207030">
     <w:abstractNumId w:val="6"/>
   </w:num>
-  <w:num w:numId="3" w16cid:durableId="1289898100">
+  <w:num w:numId="3" w16cid:durableId="1618177172">
     <w:abstractNumId w:val="5"/>
   </w:num>
-  <w:num w:numId="4" w16cid:durableId="547180727">
+  <w:num w:numId="4" w16cid:durableId="1310135460">
     <w:abstractNumId w:val="4"/>
   </w:num>
-  <w:num w:numId="5" w16cid:durableId="1139765675">
+  <w:num w:numId="5" w16cid:durableId="1177234451">
     <w:abstractNumId w:val="7"/>
   </w:num>
-  <w:num w:numId="6" w16cid:durableId="952251515">
+  <w:num w:numId="6" w16cid:durableId="208953640">
     <w:abstractNumId w:val="3"/>
   </w:num>
-  <w:num w:numId="7" w16cid:durableId="898789756">
+  <w:num w:numId="7" w16cid:durableId="2022510428">
     <w:abstractNumId w:val="2"/>
   </w:num>
-  <w:num w:numId="8" w16cid:durableId="293096895">
+  <w:num w:numId="8" w16cid:durableId="2140831238">
     <w:abstractNumId w:val="1"/>
   </w:num>
-  <w:num w:numId="9" w16cid:durableId="2123186586">
+  <w:num w:numId="9" w16cid:durableId="1254053202">
     <w:abstractNumId w:val="0"/>
   </w:num>
 </w:numbering>

</xml_diff>